<commit_message>
DD blocklist: add one-paste Copilot prompt (create/update the rule) to IT-002 + monthly email
Employees can paste a ready-made Copilot prompt into M365 Copilot / Copilot in Outlook
to auto-create or update the 'Exos DD-Blocked Senders' rule instead of clicking through
Outlook. Copilot prompt is generated with the current blocklist and included in the
monthly all-staff email; IT-002 Task 1 is now the Copilot method (manual steps kept as Task 2).

Co-Authored-By: Claude Opus 4.8 <noreply@anthropic.com>
</commit_message>
<xml_diff>
--- a/process-library/08-security-cui/IT-002_Monthly_DD-Blocked_Senders_—_Outlook_Rule_Update.docx
+++ b/process-library/08-security-cui/IT-002_Monthly_DD-Blocked_Senders_—_Outlook_Rule_Update.docx
@@ -298,7 +298,101 @@
           <w:color w:val="0B2A4A"/>
           <w:sz w:val="22"/>
         </w:rPr>
-        <w:t>Task 1 - Create the rule (first-time setup)</w:t>
+        <w:t>Task 1 - Easiest: create or update the rule with Copilot</w:t>
+      </w:r>
+    </w:p>
+    <w:p>
+      <w:pPr>
+        <w:spacing w:after="60"/>
+        <w:ind w:left="360"/>
+      </w:pPr>
+      <w:r>
+        <w:rPr>
+          <w:rFonts w:ascii="Calibri" w:hAnsi="Calibri"/>
+          <w:b w:val="0"/>
+          <w:i w:val="0"/>
+          <w:color w:val="0B2A4A"/>
+          <w:sz w:val="24"/>
+        </w:rPr>
+        <w:t xml:space="preserve">☐  </w:t>
+      </w:r>
+      <w:r>
+        <w:rPr>
+          <w:rFonts w:ascii="Calibri" w:hAnsi="Calibri"/>
+          <w:b w:val="0"/>
+          <w:i w:val="0"/>
+          <w:color w:val="1C1C1C"/>
+          <w:sz w:val="21"/>
+        </w:rPr>
+        <w:t>Open Microsoft 365 Copilot (or Copilot in Outlook) and paste the current 'Exos DD-Blocked Senders' Copilot prompt included in the monthly Exos email.</w:t>
+      </w:r>
+    </w:p>
+    <w:p>
+      <w:pPr>
+        <w:spacing w:after="60"/>
+        <w:ind w:left="360"/>
+      </w:pPr>
+      <w:r>
+        <w:rPr>
+          <w:rFonts w:ascii="Calibri" w:hAnsi="Calibri"/>
+          <w:b w:val="0"/>
+          <w:i w:val="0"/>
+          <w:color w:val="0B2A4A"/>
+          <w:sz w:val="24"/>
+        </w:rPr>
+        <w:t xml:space="preserve">☐  </w:t>
+      </w:r>
+      <w:r>
+        <w:rPr>
+          <w:rFonts w:ascii="Calibri" w:hAnsi="Calibri"/>
+          <w:b w:val="0"/>
+          <w:i w:val="0"/>
+          <w:color w:val="1C1C1C"/>
+          <w:sz w:val="21"/>
+        </w:rPr>
+        <w:t>Copilot creates the rule (or, if it already exists, adds the new domains to it) and confirms; verify in Outlook that the rule 'Exos DD-Blocked Senders' exists and is enabled.</w:t>
+      </w:r>
+    </w:p>
+    <w:p>
+      <w:pPr>
+        <w:spacing w:after="60"/>
+        <w:ind w:left="360"/>
+      </w:pPr>
+      <w:r>
+        <w:rPr>
+          <w:rFonts w:ascii="Calibri" w:hAnsi="Calibri"/>
+          <w:b w:val="0"/>
+          <w:i w:val="0"/>
+          <w:color w:val="0B2A4A"/>
+          <w:sz w:val="24"/>
+        </w:rPr>
+        <w:t xml:space="preserve">☐  </w:t>
+      </w:r>
+      <w:r>
+        <w:rPr>
+          <w:rFonts w:ascii="Calibri" w:hAnsi="Calibri"/>
+          <w:b w:val="0"/>
+          <w:i w:val="0"/>
+          <w:color w:val="1C1C1C"/>
+          <w:sz w:val="21"/>
+        </w:rPr>
+        <w:t>At each monthly refresh, paste the latest prompt again - it adds that month's new domains. If your Copilot cannot create rules directly, it will return the exact steps; use Task 2 instead.</w:t>
+      </w:r>
+    </w:p>
+    <w:p>
+      <w:pPr>
+        <w:keepNext/>
+        <w:spacing w:before="140" w:after="60"/>
+      </w:pPr>
+      <w:r>
+        <w:rPr>
+          <w:rFonts w:ascii="Calibri" w:hAnsi="Calibri"/>
+          <w:b/>
+          <w:i w:val="0"/>
+          <w:color w:val="0B2A4A"/>
+          <w:sz w:val="22"/>
+        </w:rPr>
+        <w:t>Task 2 - Create the rule manually (first-time setup)</w:t>
       </w:r>
     </w:p>
     <w:p>
@@ -496,7 +590,7 @@
           <w:color w:val="0B2A4A"/>
           <w:sz w:val="22"/>
         </w:rPr>
-        <w:t>Task 2 - Monthly update</w:t>
+        <w:t>Task 3 - Monthly update</w:t>
       </w:r>
     </w:p>
     <w:p>
@@ -616,7 +710,7 @@
           <w:color w:val="0B2A4A"/>
           <w:sz w:val="22"/>
         </w:rPr>
-        <w:t>Task 3 - Exceptions and safe use</w:t>
+        <w:t>Task 4 - Exceptions and safe use</w:t>
       </w:r>
     </w:p>
     <w:p>

</xml_diff>